<commit_message>
Answer the DOE generative AI use question
DOE asks every applicant to state the extent of generative AI use and how it
was used. The answer has two parts that a reviewer must not conflate: Grok is
the modeling environment the reactor was designed in, which is the subject of
the proposal, and a separate AI assistant drafted this text from named source
documents. Both are stated, along with what AI did not do, which is generate
any experimental value or any unverified citation.

The disclosure ships as ready-to-use language in the Forms and Certifications
Checklist, beside the duplicate-funding disclosure it parallels.

Tint blocks now split their body on newlines the way callout blocks already
did, so the four paragraphs render as paragraphs in both Word and PDF instead
of collapsing into one block.

Co-Authored-By: Claude Opus 5 <noreply@anthropic.com>
Claude-Session: https://claude.ai/code/session_01ETw3qTHBd2mcFGywgFJ3vn
</commit_message>
<xml_diff>
--- a/PlastiBioFuel/Funding_Loop/2026-08-22_DOE_SBIR-STTR_FY26-Phase-I-Genesis-Mission/04_Forms_and_Certifications_Checklist.docx
+++ b/PlastiBioFuel/Funding_Loop/2026-08-22_DOE_SBIR-STTR_FY26-Phase-I-Genesis-Mission/04_Forms_and_Certifications_Checklist.docx
@@ -3616,6 +3616,176 @@
         <w:tc>
           <w:tcPr>
             <w:tcW w:type="dxa" w:w="9360"/>
+            <w:tcBorders>
+              <w:top w:val="nil"/>
+              <w:left w:val="nil"/>
+              <w:bottom w:val="nil"/>
+              <w:right w:val="nil"/>
+            </w:tcBorders>
+            <w:tcMar>
+              <w:top w:w="0" w:type="dxa"/>
+              <w:start w:w="0" w:type="dxa"/>
+              <w:bottom w:w="0" w:type="dxa"/>
+              <w:end w:w="0" w:type="dxa"/>
+            </w:tcMar>
+            <w:shd w:val="clear" w:color="auto" w:fill="F2F7FC"/>
+            <w:tcMar>
+              <w:top w:w="220" w:type="dxa"/>
+              <w:start w:w="360" w:type="dxa"/>
+              <w:bottom w:w="220" w:type="dxa"/>
+              <w:end w:w="360" w:type="dxa"/>
+            </w:tcMar>
+          </w:tcPr>
+          <w:p>
+            <w:pPr>
+              <w:spacing w:before="0" w:after="0" w:line="276" w:lineRule="auto"/>
+            </w:pPr>
+            <w:r>
+              <w:rPr>
+                <w:rFonts w:ascii="Aptos Display" w:hAnsi="Aptos Display" w:cs="Aptos Display" w:eastAsia="Aptos Display"/>
+                <w:b/>
+                <w:i w:val="0"/>
+                <w:color w:val="045AA9"/>
+                <w:sz w:val="17"/>
+                <w:spacing w:val="24"/>
+              </w:rPr>
+              <w:t>GENERATIVE AI USE DISCLOSURE, READY TO USE</w:t>
+            </w:r>
+          </w:p>
+          <w:p>
+            <w:pPr>
+              <w:spacing w:before="80" w:after="0" w:line="300" w:lineRule="auto"/>
+            </w:pPr>
+            <w:r>
+              <w:rPr>
+                <w:rFonts w:ascii="Aptos" w:hAnsi="Aptos" w:cs="Aptos" w:eastAsia="Aptos"/>
+                <w:b w:val="0"/>
+                <w:i w:val="0"/>
+                <w:color w:val="6B7684"/>
+                <w:sz w:val="17"/>
+              </w:rPr>
+              <w:t>DOE asks every applicant to state the extent of generative AI use and how it was used. Paste this into that field. It is written for a reader who must not confuse the two uses: AI is the engineering method behind the technology, and it was separately used to draft this text.</w:t>
+            </w:r>
+          </w:p>
+          <w:p>
+            <w:pPr>
+              <w:spacing w:before="100" w:after="0" w:line="317" w:lineRule="auto"/>
+              <w:ind w:left="200"/>
+              <w:pBdr>
+                <w:left w:val="single" w:sz="12" w:space="6" w:color="045AA9"/>
+              </w:pBdr>
+            </w:pPr>
+            <w:r>
+              <w:rPr>
+                <w:rFonts w:ascii="Aptos" w:hAnsi="Aptos" w:cs="Aptos" w:eastAsia="Aptos"/>
+                <w:b w:val="0"/>
+                <w:i w:val="0"/>
+                <w:color w:val="2A2A2A"/>
+                <w:sz w:val="20"/>
+              </w:rPr>
+              <w:t>Generative AI was used in two distinct ways, and they should be read separately.</w:t>
+            </w:r>
+          </w:p>
+          <w:p>
+            <w:pPr>
+              <w:spacing w:before="140" w:after="0" w:line="317" w:lineRule="auto"/>
+              <w:ind w:left="200"/>
+              <w:pBdr>
+                <w:left w:val="single" w:sz="12" w:space="6" w:color="045AA9"/>
+              </w:pBdr>
+            </w:pPr>
+            <w:r>
+              <w:rPr>
+                <w:rFonts w:ascii="Aptos" w:hAnsi="Aptos" w:cs="Aptos" w:eastAsia="Aptos"/>
+                <w:b w:val="0"/>
+                <w:i w:val="0"/>
+                <w:color w:val="2A2A2A"/>
+                <w:sz w:val="20"/>
+              </w:rPr>
+              <w:t>1. In the research itself. Michael David Ward, Founder and CEO and the proposed principal investigator, used a commercial large language model (Grok, xAI) as a modeling and design environment to derive and test the continuous spiral-flow reactor this proposal describes. Channel geometry, flow behavior, and enzyme reusability were explored across more than one million simulation runs. He built that capability and operates it himself. This is the subject of the proposal rather than an aid to writing it, and the Phase I work proposed here is the work of quantifying where that model is trustworthy against physical measurement. The model has not been validated against a physical reactor, and the proposal says so.</w:t>
+            </w:r>
+          </w:p>
+          <w:p>
+            <w:pPr>
+              <w:spacing w:before="140" w:after="0" w:line="317" w:lineRule="auto"/>
+              <w:ind w:left="200"/>
+              <w:pBdr>
+                <w:left w:val="single" w:sz="12" w:space="6" w:color="045AA9"/>
+              </w:pBdr>
+            </w:pPr>
+            <w:r>
+              <w:rPr>
+                <w:rFonts w:ascii="Aptos" w:hAnsi="Aptos" w:cs="Aptos" w:eastAsia="Aptos"/>
+                <w:b w:val="0"/>
+                <w:i w:val="0"/>
+                <w:color w:val="2A2A2A"/>
+                <w:sz w:val="20"/>
+              </w:rPr>
+              <w:t>2. In preparing the written submission. A commercial generative AI assistant (Claude, Anthropic) was used to draft, organize, and format the narrative text of this submission from source material supplied by the applicant: the company technical file, the University of North Texas Final Project Report for Phase-I signed by Prof. Shengqian Ma and dated August 7, 2026, correspondence from Dr. Bradley Phipps, USPTO provisional application 63/848,456, and the agency’s own published solicitation pages.</w:t>
+            </w:r>
+          </w:p>
+          <w:p>
+            <w:pPr>
+              <w:spacing w:before="140" w:after="0" w:line="317" w:lineRule="auto"/>
+              <w:ind w:left="200"/>
+              <w:pBdr>
+                <w:left w:val="single" w:sz="12" w:space="6" w:color="045AA9"/>
+              </w:pBdr>
+            </w:pPr>
+            <w:r>
+              <w:rPr>
+                <w:rFonts w:ascii="Aptos" w:hAnsi="Aptos" w:cs="Aptos" w:eastAsia="Aptos"/>
+                <w:b w:val="0"/>
+                <w:i w:val="0"/>
+                <w:color w:val="2A2A2A"/>
+                <w:sz w:val="20"/>
+              </w:rPr>
+              <w:t>What generative AI did not do. It did not generate, estimate, or extrapolate any experimental result. Every laboratory value here, including the 122 µmol/h/mg immobilized turnover figure, comes from the signed UNT report. The one figure sourced outside that report, roughly 3.6 times the standard rate at 80 °C, is attributed to Dr. Phipps by email and is stated with its confounding caveat. Every reference was verified against PubMed by identifier before inclusion. No text, data, or citation was accepted without tracing it to a named primary source.</w:t>
+            </w:r>
+          </w:p>
+          <w:p>
+            <w:pPr>
+              <w:spacing w:before="140" w:after="0" w:line="317" w:lineRule="auto"/>
+              <w:ind w:left="200"/>
+              <w:pBdr>
+                <w:left w:val="single" w:sz="12" w:space="6" w:color="045AA9"/>
+              </w:pBdr>
+            </w:pPr>
+            <w:r>
+              <w:rPr>
+                <w:rFonts w:ascii="Aptos" w:hAnsi="Aptos" w:cs="Aptos" w:eastAsia="Aptos"/>
+                <w:b w:val="0"/>
+                <w:i w:val="0"/>
+                <w:color w:val="2A2A2A"/>
+                <w:sz w:val="20"/>
+              </w:rPr>
+              <w:t>Responsibility. Michael David Ward reviewed and approved every statement in this submission and is responsible for its accuracy, authenticity, and authorship. PlastiBioFuel LLC is fully capable of performing the work described. To the best of the applicant’s knowledge, this submission does not infringe or violate the rights of any third party.</w:t>
+            </w:r>
+          </w:p>
+        </w:tc>
+      </w:tr>
+    </w:tbl>
+    <w:p>
+      <w:pPr>
+        <w:spacing w:before="0" w:after="200" w:line="240" w:lineRule="auto"/>
+      </w:pPr>
+    </w:p>
+    <w:tbl>
+      <w:tblPr>
+        <w:tblW w:type="auto" w:w="0"/>
+        <w:jc w:val="left"/>
+        <w:tblLayout w:type="fixed"/>
+        <w:tblLook w:firstColumn="1" w:firstRow="1" w:lastColumn="0" w:lastRow="0" w:noHBand="0" w:noVBand="1" w:val="04A0"/>
+        <w:tblInd w:w="0" w:type="dxa"/>
+        <w:tblLayout w:type="fixed"/>
+      </w:tblPr>
+      <w:tblGrid>
+        <w:gridCol w:w="9360"/>
+      </w:tblGrid>
+      <w:tr>
+        <w:tc>
+          <w:tcPr>
+            <w:tcW w:type="dxa" w:w="9360"/>
             <w:tcMar>
               <w:top w:w="0" w:type="dxa"/>
               <w:start w:w="0" w:type="dxa"/>

</xml_diff>